<commit_message>
Update MOP docx to reflect all reviewer fixes
- Section 5 (Stage B): add -WslRepoDir optional note and example command
- Section 5.1 verification table: add row 4 for OpenClaw-Stack-DelayedStart task
- Section 6 (Stage C) config table: add OPENCLAW_VERSION and REPO_REVISION rows
- Section 7 phase table: update packages (python3-pip), wsl_config (merge), openclaw (version pin), repo (revision pin)
- Section 8.2 reboot test: change wait from 30-60 seconds to 2-3 minutes
- Section 9.3 rollback: add Unregister-ScheduledTask for OpenClaw-Stack-DelayedStart

Co-Authored-By: Claude Sonnet 4.6 <noreply@anthropic.com>
</commit_message>
<xml_diff>
--- a/MOP_OpenClaw_n8n_Deployment.docx
+++ b/MOP_OpenClaw_n8n_Deployment.docx
@@ -3393,6 +3393,40 @@
           <w:b/>
           <w:bCs/>
         </w:rPr>
+        <w:t xml:space="preserve">Optional ? </w:t>
+      </w:r>
+      <w:r>
+        <w:t xml:space="preserve">if REPO_DIR in config.env differs from the default (~/diplomatic-expression-docker), pass -WslRepoDir so the autostart launcher points at the right path:</w:t>
+      </w:r>
+    </w:p>
+    <w:p>
+      <w:pPr>
+        <w:pBdr>
+          <w:left w:val="single" w:color="2E75B6" w:sz="18" w:space="8"/>
+        </w:pBdr>
+        <w:shd w:fill="F2F4F7" w:val="clear"/>
+        <w:spacing w:after="120" w:before="0" w:line="240"/>
+        <w:ind w:left="200" w:right="200"/>
+      </w:pPr>
+      <w:r>
+        <w:rPr>
+          <w:rFonts w:ascii="Consolas" w:cs="Consolas" w:eastAsia="Consolas" w:hAnsi="Consolas"/>
+          <w:color w:val="1A1A2E"/>
+          <w:sz w:val="18"/>
+          <w:szCs w:val="18"/>
+        </w:rPr>
+        <w:t xml:space="preserve">.\windows-setup.ps1 -WslDistro 'Ubuntu' -WslUser '&lt;your-linux-user&gt;' -WslRepoDir '&lt;linux-repo-path&gt;'</w:t>
+      </w:r>
+    </w:p>
+    <w:p>
+      <w:pPr>
+        <w:spacing w:after="120" w:line="276"/>
+      </w:pPr>
+      <w:r>
+        <w:rPr>
+          <w:b/>
+          <w:bCs/>
+        </w:rPr>
         <w:t xml:space="preserve">Optional — </w:t>
       </w:r>
       <w:r>
@@ -3972,6 +4006,125 @@
           </w:p>
         </w:tc>
       </w:tr>
+      <w:tr>
+        <w:tc>
+          <w:tcPr>
+            <w:tcW w:type="dxa" w:w="500"/>
+            <w:tcBorders>
+              <w:top w:val="single" w:color="CCD4DE" w:sz="1"/>
+              <w:left w:val="single" w:color="CCD4DE" w:sz="1"/>
+              <w:bottom w:val="single" w:color="CCD4DE" w:sz="1"/>
+              <w:right w:val="single" w:color="CCD4DE" w:sz="1"/>
+            </w:tcBorders>
+            <w:shd w:fill="E8EEF4" w:val="clear"/>
+            <w:tcMar>
+              <w:top w:type="dxa" w:w="60"/>
+              <w:left w:type="dxa" w:w="110"/>
+              <w:bottom w:type="dxa" w:w="60"/>
+              <w:right w:type="dxa" w:w="110"/>
+            </w:tcMar>
+            <w:vAlign w:val="center"/>
+          </w:tcPr>
+          <w:p>
+            <w:r>
+              <w:rPr>
+                <w:sz w:val="18"/>
+                <w:szCs w:val="18"/>
+              </w:rPr>
+              <w:t xml:space="preserve">4</w:t>
+            </w:r>
+          </w:p>
+        </w:tc>
+        <w:tc>
+          <w:tcPr>
+            <w:tcW w:type="dxa" w:w="2500"/>
+            <w:tcBorders>
+              <w:top w:val="single" w:color="CCD4DE" w:sz="1"/>
+              <w:left w:val="single" w:color="CCD4DE" w:sz="1"/>
+              <w:bottom w:val="single" w:color="CCD4DE" w:sz="1"/>
+              <w:right w:val="single" w:color="CCD4DE" w:sz="1"/>
+            </w:tcBorders>
+            <w:shd w:fill="E8EEF4" w:val="clear"/>
+            <w:tcMar>
+              <w:top w:type="dxa" w:w="60"/>
+              <w:left w:type="dxa" w:w="110"/>
+              <w:bottom w:type="dxa" w:w="60"/>
+              <w:right w:type="dxa" w:w="110"/>
+            </w:tcMar>
+            <w:vAlign w:val="center"/>
+          </w:tcPr>
+          <w:p>
+            <w:r>
+              <w:rPr>
+                <w:sz w:val="18"/>
+                <w:szCs w:val="18"/>
+              </w:rPr>
+              <w:t xml:space="preserve">Delayed-start task registered (always)</w:t>
+            </w:r>
+          </w:p>
+        </w:tc>
+        <w:tc>
+          <w:tcPr>
+            <w:tcW w:type="dxa" w:w="3360"/>
+            <w:tcBorders>
+              <w:top w:val="single" w:color="CCD4DE" w:sz="1"/>
+              <w:left w:val="single" w:color="CCD4DE" w:sz="1"/>
+              <w:bottom w:val="single" w:color="CCD4DE" w:sz="1"/>
+              <w:right w:val="single" w:color="CCD4DE" w:sz="1"/>
+            </w:tcBorders>
+            <w:shd w:fill="E8EEF4" w:val="clear"/>
+            <w:tcMar>
+              <w:top w:type="dxa" w:w="60"/>
+              <w:left w:type="dxa" w:w="110"/>
+              <w:bottom w:type="dxa" w:w="60"/>
+              <w:right w:type="dxa" w:w="110"/>
+            </w:tcMar>
+            <w:vAlign w:val="center"/>
+          </w:tcPr>
+          <w:p>
+            <w:r>
+              <w:rPr>
+                <w:rFonts w:ascii="Consolas" w:cs="Consolas" w:eastAsia="Consolas" w:hAnsi="Consolas"/>
+                <w:color w:val="0F4C81"/>
+                <w:sz w:val="16"/>
+                <w:szCs w:val="16"/>
+              </w:rPr>
+              <w:t xml:space="preserve">Get-ScheduledTask -TaskName OpenClaw-Stack-DelayedStart</w:t>
+            </w:r>
+          </w:p>
+        </w:tc>
+        <w:tc>
+          <w:tcPr>
+            <w:tcW w:type="dxa" w:w="3000"/>
+            <w:tcBorders>
+              <w:top w:val="single" w:color="CCD4DE" w:sz="1"/>
+              <w:left w:val="single" w:color="CCD4DE" w:sz="1"/>
+              <w:bottom w:val="single" w:color="CCD4DE" w:sz="1"/>
+              <w:right w:val="single" w:color="CCD4DE" w:sz="1"/>
+            </w:tcBorders>
+            <w:shd w:fill="E8EEF4" w:val="clear"/>
+            <w:tcMar>
+              <w:top w:type="dxa" w:w="60"/>
+              <w:left w:type="dxa" w:w="110"/>
+              <w:bottom w:type="dxa" w:w="60"/>
+              <w:right w:type="dxa" w:w="110"/>
+            </w:tcMar>
+            <w:vAlign w:val="center"/>
+          </w:tcPr>
+          <w:p>
+            <w:r>
+              <w:rPr>
+                <w:i/>
+                <w:iCs/>
+                <w:color w:val="5A5A5A"/>
+                <w:sz w:val="17"/>
+                <w:szCs w:val="17"/>
+              </w:rPr>
+              <w:t xml:space="preserve">State = Ready</w:t>
+            </w:r>
+          </w:p>
+        </w:tc>
+      </w:tr>
     </w:tbl>
     <w:p>
       <w:pPr>
@@ -4332,6 +4485,126 @@
                 <w:szCs w:val="18"/>
               </w:rPr>
               <w:t xml:space="preserve">npm (default). Set to skip if OpenClaw is already installed.</w:t>
+            </w:r>
+          </w:p>
+        </w:tc>
+      </w:tr>
+      <w:tr>
+        <w:tc>
+          <w:tcPr>
+            <w:tcW w:type="dxa" w:w="3200"/>
+            <w:tcBorders>
+              <w:top w:val="single" w:color="CCD4DE" w:sz="1"/>
+              <w:left w:val="single" w:color="CCD4DE" w:sz="1"/>
+              <w:bottom w:val="single" w:color="CCD4DE" w:sz="1"/>
+              <w:right w:val="single" w:color="CCD4DE" w:sz="1"/>
+            </w:tcBorders>
+            <w:shd w:fill="FFFFFF" w:val="clear"/>
+            <w:tcMar>
+              <w:top w:type="dxa" w:w="60"/>
+              <w:left w:type="dxa" w:w="110"/>
+              <w:bottom w:type="dxa" w:w="60"/>
+              <w:right w:type="dxa" w:w="110"/>
+            </w:tcMar>
+            <w:vAlign w:val="center"/>
+          </w:tcPr>
+          <w:p>
+            <w:r>
+              <w:rPr>
+                <w:rFonts w:ascii="Consolas" w:cs="Consolas" w:eastAsia="Consolas" w:hAnsi="Consolas"/>
+                <w:color w:val="0F4C81"/>
+                <w:sz w:val="17"/>
+                <w:szCs w:val="17"/>
+              </w:rPr>
+              <w:t xml:space="preserve">OPENCLAW_VERSION</w:t>
+            </w:r>
+          </w:p>
+        </w:tc>
+        <w:tc>
+          <w:tcPr>
+            <w:tcW w:type="dxa" w:w="6160"/>
+            <w:tcBorders>
+              <w:top w:val="single" w:color="CCD4DE" w:sz="1"/>
+              <w:left w:val="single" w:color="CCD4DE" w:sz="1"/>
+              <w:bottom w:val="single" w:color="CCD4DE" w:sz="1"/>
+              <w:right w:val="single" w:color="CCD4DE" w:sz="1"/>
+            </w:tcBorders>
+            <w:shd w:fill="FFFFFF" w:val="clear"/>
+            <w:tcMar>
+              <w:top w:type="dxa" w:w="60"/>
+              <w:left w:type="dxa" w:w="110"/>
+              <w:bottom w:type="dxa" w:w="60"/>
+              <w:right w:type="dxa" w:w="110"/>
+            </w:tcMar>
+            <w:vAlign w:val="center"/>
+          </w:tcPr>
+          <w:p>
+            <w:r>
+              <w:rPr>
+                <w:sz w:val="18"/>
+                <w:szCs w:val="18"/>
+              </w:rPr>
+              <w:t xml:space="preserve">Pin the npm package version (e.g. 1.4.2). Leave blank for latest. Set for reproducible client deploys.</w:t>
+            </w:r>
+          </w:p>
+        </w:tc>
+      </w:tr>
+      <w:tr>
+        <w:tc>
+          <w:tcPr>
+            <w:tcW w:type="dxa" w:w="3200"/>
+            <w:tcBorders>
+              <w:top w:val="single" w:color="CCD4DE" w:sz="1"/>
+              <w:left w:val="single" w:color="CCD4DE" w:sz="1"/>
+              <w:bottom w:val="single" w:color="CCD4DE" w:sz="1"/>
+              <w:right w:val="single" w:color="CCD4DE" w:sz="1"/>
+            </w:tcBorders>
+            <w:shd w:fill="E8EEF4" w:val="clear"/>
+            <w:tcMar>
+              <w:top w:type="dxa" w:w="60"/>
+              <w:left w:type="dxa" w:w="110"/>
+              <w:bottom w:type="dxa" w:w="60"/>
+              <w:right w:type="dxa" w:w="110"/>
+            </w:tcMar>
+            <w:vAlign w:val="center"/>
+          </w:tcPr>
+          <w:p>
+            <w:r>
+              <w:rPr>
+                <w:rFonts w:ascii="Consolas" w:cs="Consolas" w:eastAsia="Consolas" w:hAnsi="Consolas"/>
+                <w:color w:val="0F4C81"/>
+                <w:sz w:val="17"/>
+                <w:szCs w:val="17"/>
+              </w:rPr>
+              <w:t xml:space="preserve">REPO_REVISION</w:t>
+            </w:r>
+          </w:p>
+        </w:tc>
+        <w:tc>
+          <w:tcPr>
+            <w:tcW w:type="dxa" w:w="6160"/>
+            <w:tcBorders>
+              <w:top w:val="single" w:color="CCD4DE" w:sz="1"/>
+              <w:left w:val="single" w:color="CCD4DE" w:sz="1"/>
+              <w:bottom w:val="single" w:color="CCD4DE" w:sz="1"/>
+              <w:right w:val="single" w:color="CCD4DE" w:sz="1"/>
+            </w:tcBorders>
+            <w:shd w:fill="E8EEF4" w:val="clear"/>
+            <w:tcMar>
+              <w:top w:type="dxa" w:w="60"/>
+              <w:left w:type="dxa" w:w="110"/>
+              <w:bottom w:type="dxa" w:w="60"/>
+              <w:right w:type="dxa" w:w="110"/>
+            </w:tcMar>
+            <w:vAlign w:val="center"/>
+          </w:tcPr>
+          <w:p>
+            <w:r>
+              <w:rPr>
+                <w:sz w:val="18"/>
+                <w:szCs w:val="18"/>
+              </w:rPr>
+              <w:t xml:space="preserve">Pin the app repo to a git tag or commit (e.g. v1.0.0). Leave blank to pull latest main. Set for reproducible client deploys.</w:t>
             </w:r>
           </w:p>
         </w:tc>
@@ -4939,7 +5212,7 @@
                 <w:sz w:val="18"/>
                 <w:szCs w:val="18"/>
               </w:rPr>
-              <w:t xml:space="preserve">Installs curl, git, jq, python3, openssl, etc.</w:t>
+              <w:t xml:space="preserve">Installs curl, git, jq, python3, python3-pip, openssl, etc.</w:t>
             </w:r>
           </w:p>
         </w:tc>
@@ -5025,7 +5298,7 @@
                 <w:sz w:val="18"/>
                 <w:szCs w:val="18"/>
               </w:rPr>
-              <w:t xml:space="preserve">Ensures systemd enabled in /etc/wsl.conf.</w:t>
+              <w:t xml:space="preserve">Merges systemd=true into /etc/wsl.conf, preserving all other existing sections.</w:t>
             </w:r>
           </w:p>
         </w:tc>
@@ -5283,7 +5556,7 @@
                 <w:sz w:val="18"/>
                 <w:szCs w:val="18"/>
               </w:rPr>
-              <w:t xml:space="preserve">Installs OpenClaw (or skips if present).</w:t>
+              <w:t xml:space="preserve">Installs OpenClaw at OPENCLAW_VERSION if set in config.env, or latest (or skips if present).</w:t>
             </w:r>
           </w:p>
         </w:tc>
@@ -5541,7 +5814,7 @@
                 <w:sz w:val="18"/>
                 <w:szCs w:val="18"/>
               </w:rPr>
-              <w:t xml:space="preserve">Clones or updates the application repository.</w:t>
+              <w:t xml:space="preserve">Clones or updates the application repository; checks out REPO_REVISION if pinned in config.env.</w:t>
             </w:r>
           </w:p>
         </w:tc>
@@ -7118,6 +7391,25 @@
           <w:szCs w:val="18"/>
         </w:rPr>
         <w:t xml:space="preserve">Unregister-ScheduledTask -TaskName OpenClaw-CDP-Autostart -Confirm:$false   # if browser was enabled</w:t>
+      </w:r>
+    </w:p>
+    <w:p>
+      <w:pPr>
+        <w:pBdr>
+          <w:left w:val="single" w:color="2E75B6" w:sz="18" w:space="8"/>
+        </w:pBdr>
+        <w:shd w:fill="F2F4F7" w:val="clear"/>
+        <w:spacing w:after="120" w:before="0" w:line="240"/>
+        <w:ind w:left="200" w:right="200"/>
+      </w:pPr>
+      <w:r>
+        <w:rPr>
+          <w:rFonts w:ascii="Consolas" w:cs="Consolas" w:eastAsia="Consolas" w:hAnsi="Consolas"/>
+          <w:color w:val="1A1A2E"/>
+          <w:sz w:val="18"/>
+          <w:szCs w:val="18"/>
+        </w:rPr>
+        <w:t xml:space="preserve">Unregister-ScheduledTask -TaskName OpenClaw-Stack-DelayedStart -Confirm:$false</w:t>
       </w:r>
     </w:p>
     <w:tbl>

</xml_diff>